<commit_message>
Fix citations and submission manifest
</commit_message>
<xml_diff>
--- a/supplement/Module_14_Technical_Supplement_Pruned_Evidence_Gate_Ravi_Bajaj.docx
+++ b/supplement/Module_14_Technical_Supplement_Pruned_Evidence_Gate_Ravi_Bajaj.docx
@@ -149,6 +149,14 @@
       </w:pPr>
       <w:r>
         <w:t>Case Matrix</w:t>
+      </w:r>
+    </w:p>
+    <w:p>
+      <w:r>
+        <w:rPr>
+          <w:rFonts w:ascii="Aptos" w:hAnsi="Aptos" w:eastAsia="Aptos"/>
+        </w:rPr>
+        <w:t>The final case matrix contains 33 author-designed synthetic cases: 10 bounded aligned alerts and 23 designed overclaim archetypes. PGX31-PGX33 were added after review feedback to isolate gate necessity rather than merely increasing case count: PGX31 and PGX33 are citation/guideline-support-only failures, PGX32 is a population-fit-only failure, and six endpoint-only cases remain in the bank.</w:t>
       </w:r>
     </w:p>
     <w:tbl>
@@ -2146,7 +2154,7 @@
           </w:tcPr>
           <w:p>
             <w:r>
-              <w:t>Designed overclaim archetypes blocked</w:t>
+              <w:t>Designed overclaim archetypes intercepted</w:t>
             </w:r>
           </w:p>
         </w:tc>
@@ -2294,7 +2302,10 @@
     </w:p>
     <w:p>
       <w:r>
-        <w:t>One-gate ablations disable exactly one gate while leaving the other two gates active. The three added isolating cases make the ablation informative: citation/guideline support, population fit, and endpoint/actionability each uniquely catch at least one synthetic overclaim archetype. Counts remain synthetic Stage 1 diagnostics, not clinical utility estimates.</w:t>
+        <w:rPr>
+          <w:rFonts w:ascii="Aptos" w:hAnsi="Aptos" w:eastAsia="Aptos"/>
+        </w:rPr>
+        <w:t>One-gate ablations disable exactly one gate while leaving the other two gates active. The isolating cases make the ablation causal rather than decorative: PGX31 and PGX33 are uniquely caught by citation/guideline support, PGX32 is uniquely caught by population fit, and six endpoint-only cases are uniquely caught by endpoint/actionability. Disabling citation/guideline support lets 2/23 designed overclaims through unchanged, disabling population fit lets 1/23 through, and disabling endpoint/actionability lets 6/23 through. Counts remain synthetic Stage 1 diagnostics, not clinical utility estimates.</w:t>
       </w:r>
     </w:p>
     <w:tbl>

</xml_diff>

<commit_message>
Prune ML4H conformance table
</commit_message>
<xml_diff>
--- a/supplement/Module_14_Technical_Supplement_Pruned_Evidence_Gate_Ravi_Bajaj.docx
+++ b/supplement/Module_14_Technical_Supplement_Pruned_Evidence_Gate_Ravi_Bajaj.docx
@@ -109,6 +109,14 @@
           <w:rFonts w:ascii="Calibri" w:hAnsi="Calibri"/>
         </w:rPr>
         <w:t>Stage 1 results are specification-conformance counts on author-designed synthetic archetypes, not independent safety, accuracy, or generalization. The controller consumes structured evidence annotations only; it does not parse free text or call an LLM.</w:t>
+      </w:r>
+    </w:p>
+    <w:p>
+      <w:r>
+        <w:rPr>
+          <w:rFonts w:ascii="Aptos" w:hAnsi="Aptos" w:eastAsia="Aptos"/>
+        </w:rPr>
+        <w:t>Venue split: the ML4H LaTeX shows only the ablation table; the course DOCX and supplement retain full conformance accounting for grading and reproducibility.</w:t>
       </w:r>
     </w:p>
     <w:p>
@@ -2305,7 +2313,7 @@
         <w:rPr>
           <w:rFonts w:ascii="Aptos" w:hAnsi="Aptos" w:eastAsia="Aptos"/>
         </w:rPr>
-        <w:t>One-gate ablations disable exactly one gate while leaving the other two gates active. The isolating cases make the ablation causal rather than decorative: PGX31 and PGX33 are uniquely caught by citation/guideline support, PGX32 is uniquely caught by population fit, and six endpoint-only cases are uniquely caught by endpoint/actionability. Disabling citation/guideline support lets 2/23 designed overclaims through unchanged, disabling population fit lets 1/23 through, and disabling endpoint/actionability lets 6/23 through. Counts remain synthetic Stage 1 diagnostics, not clinical utility estimates.</w:t>
+        <w:t>One-gate ablations disable exactly one gate. PGX31 and PGX33 isolate citation/guideline support, PGX32 isolates population fit, and six endpoint-only cases isolate endpoint/actionability. Disabling the three gates lets 2/23, 1/23, and 6/23 designed overclaims through unchanged, respectively. Counts remain synthetic diagnostics, not clinical utility estimates.</w:t>
       </w:r>
     </w:p>
     <w:tbl>
@@ -2605,7 +2613,7 @@
     <w:sectPr>
       <w:footerReference w:type="default" r:id="rId9"/>
       <w:pgSz w:w="12240" w:h="15840"/>
-      <w:pgMar w:top="1152" w:right="1224" w:bottom="1080" w:left="1224" w:header="648" w:footer="504" w:gutter="0"/>
+      <w:pgMar w:top="1008" w:right="1224" w:bottom="792" w:left="1224" w:header="648" w:footer="504" w:gutter="0"/>
       <w:cols w:space="720"/>
       <w:docGrid w:linePitch="360"/>
     </w:sectPr>

</xml_diff>

<commit_message>
Correct IFNL3 citation and Arm B framing
</commit_message>
<xml_diff>
--- a/supplement/Module_14_Technical_Supplement_Pruned_Evidence_Gate_Ravi_Bajaj.docx
+++ b/supplement/Module_14_Technical_Supplement_Pruned_Evidence_Gate_Ravi_Bajaj.docx
@@ -2635,7 +2635,7 @@
     </w:p>
     <w:p>
       <w:r>
-        <w:t>Two LLM comparator arms were retained. Arm A is the frozen full-bank baseline with source-support labels included; both models routed 23/23 designed overclaims and preserved 10/10 bounded alerts. Arm B is scoped only to PGX31-PGX33 and withholds the source-support label. After sentinel cues were removed, GPT-5.6-terra matched PGX32 and PGX33 but attributed PGX31 to claim strength, while Grok-4.5 matched PGX31 and PGX32 but attributed PGX33 to claim strength. A synthetic uniform-NARROW row shows why bounded-alert preservation matters: a uniformly cautious reviewer routes 23/23 overclaims but preserves 0/10 bounded alerts and narrows 33/33 cases.</w:t>
+        <w:t>Two LLM comparator arms were retained. Arm A is the frozen full-bank baseline with source-support labels included; both models routed 23/23 designed overclaims and preserved 10/10 bounded alerts. Arm B is scoped only to PGX31-PGX33 and withholds the source-support label. After sentinel cues were removed and PGX33 was tied to the primary Muir 2014 DOI source, GPT-5.6-terra matched PGX31, PGX32, and PGX33, while Grok-4.5 matched PGX31 and PGX32 but attributed PGX33 to claim strength. Neither Arm B model was given retrieval capability; a well-formed fabricated citation is not detectable from citation text alone. A synthetic uniform-NARROW row shows why bounded-alert preservation matters: a uniformly cautious reviewer routes 23/23 overclaims but preserves 0/10 bounded alerts and narrows 33/33 cases.</w:t>
       </w:r>
     </w:p>
     <w:tbl>
@@ -2854,7 +2854,7 @@
           </w:tcPr>
           <w:p>
             <w:r>
-              <w:t>Matched PGX32 and PGX33; PGX31 differed as unsupported action / claim strength.</w:t>
+              <w:t>Matched PGX31, PGX32, and PGX33.</w:t>
             </w:r>
           </w:p>
         </w:tc>

</xml_diff>

<commit_message>
Fix directional extraction ordering
</commit_message>
<xml_diff>
--- a/supplement/Module_14_Technical_Supplement_Pruned_Evidence_Gate_Ravi_Bajaj.docx
+++ b/supplement/Module_14_Technical_Supplement_Pruned_Evidence_Gate_Ravi_Bajaj.docx
@@ -1158,7 +1158,7 @@
           </w:tcPr>
           <w:p>
             <w:r>
-              <w:t>45 conservative errors vs. 9 permissive errors.</w:t>
+              <w:t>44 conservative errors vs. 10 permissive errors.</w:t>
             </w:r>
           </w:p>
         </w:tc>
@@ -1180,7 +1180,7 @@
           </w:tcPr>
           <w:p>
             <w:r>
-              <w:t>42 conservative errors vs. 4 permissive errors.</w:t>
+              <w:t>41 conservative errors vs. 5 permissive errors.</w:t>
             </w:r>
           </w:p>
         </w:tc>
@@ -1236,6 +1236,28 @@
           </w:tcPr>
           <w:p>
             <w:r>
+              <w:t>Endpoint-level exception</w:t>
+            </w:r>
+          </w:p>
+        </w:tc>
+        <w:tc>
+          <w:tcPr>
+            <w:tcW w:type="dxa" w:w="5040"/>
+          </w:tcPr>
+          <w:p>
+            <w:r>
+              <w:t>GPT endpoint errors were more permissive than conservative in both conditions; Grok was only mildly conservative.</w:t>
+            </w:r>
+          </w:p>
+        </w:tc>
+      </w:tr>
+      <w:tr>
+        <w:tc>
+          <w:tcPr>
+            <w:tcW w:type="dxa" w:w="5040"/>
+          </w:tcPr>
+          <w:p>
+            <w:r>
               <w:t>Macro-F1, GPT with citation</w:t>
             </w:r>
           </w:p>
@@ -1276,7 +1298,7 @@
     </w:tbl>
     <w:p>
       <w:r>
-        <w:t>Full macro-precision, macro-recall, and macro-F1 for every field, model, and condition are written to results/text_only_extraction_field_prf.csv. Several enum cells contain one or two observations, so macro-F1 is indicative rather than precise.</w:t>
+        <w:t>Full macro-precision, macro-recall, and macro-F1 for every field, model, and condition are written to results/text_only_extraction_field_prf.csv. Several enum cells contain one or two observations, so macro-F1 is indicative rather than precise. Endpoint-level errors should be read separately from the source, population, and actionability fields because endpoint classification requires judging what class of scientific evidence supports the alert.</w:t>
       </w:r>
     </w:p>
     <w:p>

</xml_diff>